<commit_message>
Add deconfounded AUC and shortcut mitigation; retarget paper to CMPB
CIBM desk-rejected the manuscript for insufficient novelty. This adds two
methodological contributions and rewrites the paper around them:

- Deconfounded AUC: patients weighted by P(y)/P(y|phone) so the label is
  independent of the phone; any phone-only score gets 0.5.
- Shortcut mitigation: 13 variants (colour constancy, phone as covariate,
  reweighting, per-phone standardisation, LEACE and combinations,
  gradient-reversal adversarial training) on DINOv2 and ConvNeXt embeddings,
  with a linear probe of the phone information left behind.

New code in src/mitigate.py, scripts/run_mitigation.sh and
tests/test_mitigate.py; new figure (also the graphical abstract), Tables 4-5,
nine verified references, and updated highlights, cover letter, TRIPOD+AI
page numbers, READMEs, CITATION.cff and the analysis-plan addendum.
</commit_message>
<xml_diff>
--- a/paper/latex/highlights.docx
+++ b/paper/latex/highlights.docx
@@ -3,148 +3,80 @@
 <w:document xmlns:ve="http://schemas.openxmlformats.org/markup-compatibility/2006" xmlns:o="urn:schemas-microsoft-com:office:office" xmlns:r="http://schemas.openxmlformats.org/officeDocument/2006/relationships" xmlns:v="urn:schemas-microsoft-com:vml" xmlns:wp="http://schemas.openxmlformats.org/drawingml/2006/wordprocessingDrawing" xmlns:w10="urn:schemas-microsoft-com:office:word" xmlns:w="http://schemas.openxmlformats.org/wordprocessingml/2006/main">
   <w:body>
     <w:p>
-      <w:pPr>
-        <w:spacing w:after="280"/>
-      </w:pPr>
-      <w:r>
-        <w:rPr>
-          <w:rFonts w:ascii="Times" w:hAnsi="Times" w:cs="Times"/>
-          <w:sz w:val="28"/>
-          <w:sz-cs w:val="28"/>
-          <w:b/>
-          <w:spacing w:val="0"/>
+      <w:pPr/>
+      <w:r>
+        <w:rPr>
+          <w:rFonts w:ascii="Helvetica Light" w:hAnsi="Helvetica Light" w:cs="Helvetica Light"/>
+          <w:sz w:val="24"/>
+          <w:sz-cs w:val="24"/>
         </w:rPr>
         <w:t xml:space="preserve">Highlights</w:t>
       </w:r>
     </w:p>
     <w:p>
-      <w:pPr>
-        <w:ind w:left="720" w:first-line="-720"/>
-      </w:pPr>
-      <w:r>
-        <w:rPr>
-          <w:rFonts w:ascii="Times" w:hAnsi="Times" w:cs="Times"/>
+      <w:pPr/>
+      <w:r>
+        <w:rPr>
+          <w:rFonts w:ascii="Helvetica Light" w:hAnsi="Helvetica Light" w:cs="Helvetica Light"/>
           <w:sz w:val="24"/>
           <w:sz-cs w:val="24"/>
         </w:rPr>
         <w:t xml:space="preserve"/>
-        <w:tab/>
-        <w:t xml:space="preserve">•</w:t>
-        <w:tab/>
-        <w:t xml:space="preserve"/>
-      </w:r>
-      <w:r>
-        <w:rPr>
-          <w:rFonts w:ascii="Times" w:hAnsi="Times" w:cs="Times"/>
-          <w:sz w:val="24"/>
-          <w:sz-cs w:val="24"/>
-          <w:spacing w:val="0"/>
-        </w:rPr>
-        <w:t xml:space="preserve">First multimodal benchmark on PGUPharyngitis: images, 20 symptoms, age and sex.</w:t>
-      </w:r>
-    </w:p>
-    <w:p>
-      <w:pPr>
-        <w:ind w:left="720" w:first-line="-720"/>
-      </w:pPr>
-      <w:r>
-        <w:rPr>
-          <w:rFonts w:ascii="Times" w:hAnsi="Times" w:cs="Times"/>
-          <w:sz w:val="24"/>
-          <w:sz-cs w:val="24"/>
-        </w:rPr>
-        <w:t xml:space="preserve"/>
-        <w:tab/>
-        <w:t xml:space="preserve">•</w:t>
-        <w:tab/>
-        <w:t xml:space="preserve"/>
-      </w:r>
-      <w:r>
-        <w:rPr>
-          <w:rFonts w:ascii="Times" w:hAnsi="Times" w:cs="Times"/>
-          <w:sz w:val="24"/>
-          <w:sz-cs w:val="24"/>
-          <w:spacing w:val="0"/>
-        </w:rPr>
-        <w:t xml:space="preserve">Phone model alone predicts expert labels (AUC 0.67), beating the published baseline.</w:t>
-      </w:r>
-    </w:p>
-    <w:p>
-      <w:pPr>
-        <w:ind w:left="720" w:first-line="-720"/>
-      </w:pPr>
-      <w:r>
-        <w:rPr>
-          <w:rFonts w:ascii="Times" w:hAnsi="Times" w:cs="Times"/>
-          <w:sz w:val="24"/>
-          <w:sz-cs w:val="24"/>
-        </w:rPr>
-        <w:t xml:space="preserve"/>
-        <w:tab/>
-        <w:t xml:space="preserve">•</w:t>
-        <w:tab/>
-        <w:t xml:space="preserve"/>
-      </w:r>
-      <w:r>
-        <w:rPr>
-          <w:rFonts w:ascii="Times" w:hAnsi="Times" w:cs="Times"/>
-          <w:sz w:val="24"/>
-          <w:sz-cs w:val="24"/>
-          <w:spacing w:val="0"/>
-        </w:rPr>
-        <w:t xml:space="preserve">Image features identify the phone (AUC 0.99) but fail across phones (AUC ≈ 0.5).</w:t>
-      </w:r>
-    </w:p>
-    <w:p>
-      <w:pPr>
-        <w:ind w:left="720" w:first-line="-720"/>
-      </w:pPr>
-      <w:r>
-        <w:rPr>
-          <w:rFonts w:ascii="Times" w:hAnsi="Times" w:cs="Times"/>
-          <w:sz w:val="24"/>
-          <w:sz-cs w:val="24"/>
-        </w:rPr>
-        <w:t xml:space="preserve"/>
-        <w:tab/>
-        <w:t xml:space="preserve">•</w:t>
-        <w:tab/>
-        <w:t xml:space="preserve"/>
-      </w:r>
-      <w:r>
-        <w:rPr>
-          <w:rFonts w:ascii="Times" w:hAnsi="Times" w:cs="Times"/>
-          <w:sz w:val="24"/>
-          <w:sz-cs w:val="24"/>
-          <w:spacing w:val="0"/>
-        </w:rPr>
-        <w:t xml:space="preserve">Within one phone, image AUC falls to 0.50–0.58; 18 colour statistics match deep nets.</w:t>
-      </w:r>
-    </w:p>
-    <w:p>
-      <w:pPr>
-        <w:ind w:left="720" w:first-line="-720"/>
-      </w:pPr>
-      <w:r>
-        <w:rPr>
-          <w:rFonts w:ascii="Times" w:hAnsi="Times" w:cs="Times"/>
-          <w:sz w:val="24"/>
-          <w:sz-cs w:val="24"/>
-        </w:rPr>
-        <w:t xml:space="preserve"/>
-        <w:tab/>
-        <w:t xml:space="preserve">•</w:t>
-        <w:tab/>
-        <w:t xml:space="preserve"/>
-      </w:r>
-      <w:r>
-        <w:rPr>
-          <w:rFonts w:ascii="Times" w:hAnsi="Times" w:cs="Times"/>
-          <w:sz w:val="24"/>
-          <w:sz-cs w:val="24"/>
-          <w:spacing w:val="0"/>
-        </w:rPr>
-        <w:t xml:space="preserve">Symptom fusion adds nothing over images; benchmarks need site-aware evaluation.</w:t>
+      </w:r>
+    </w:p>
+    <w:p>
+      <w:pPr/>
+      <w:r>
+        <w:rPr>
+          <w:rFonts w:ascii="Helvetica Light" w:hAnsi="Helvetica Light" w:cs="Helvetica Light"/>
+          <w:sz w:val="24"/>
+          <w:sz-cs w:val="24"/>
+        </w:rPr>
+        <w:t xml:space="preserve">- The phone model alone predicts expert pharyngitis labels with AUC 0.67.</w:t>
+      </w:r>
+    </w:p>
+    <w:p>
+      <w:pPr/>
+      <w:r>
+        <w:rPr>
+          <w:rFonts w:ascii="Helvetica Light" w:hAnsi="Helvetica Light" w:cs="Helvetica Light"/>
+          <w:sz w:val="24"/>
+          <w:sz-cs w:val="24"/>
+        </w:rPr>
+        <w:t xml:space="preserve">- A deconfounded AUC, under which any phone-only model scores 0.5, is introduced.</w:t>
+      </w:r>
+    </w:p>
+    <w:p>
+      <w:pPr/>
+      <w:r>
+        <w:rPr>
+          <w:rFonts w:ascii="Helvetica Light" w:hAnsi="Helvetica Light" w:cs="Helvetica Light"/>
+          <w:sz w:val="24"/>
+          <w:sz-cs w:val="24"/>
+        </w:rPr>
+        <w:t xml:space="preserve">- Deconfounded, image and fusion models fall from about 0.70 to 0.52–0.58.</w:t>
+      </w:r>
+    </w:p>
+    <w:p>
+      <w:pPr/>
+      <w:r>
+        <w:rPr>
+          <w:rFonts w:ascii="Helvetica Light" w:hAnsi="Helvetica Light" w:cs="Helvetica Light"/>
+          <w:sz w:val="24"/>
+          <w:sz-cs w:val="24"/>
+        </w:rPr>
+        <w:t xml:space="preserve">- Concept erasure removes the phone signal but recovers no throat signal.</w:t>
+      </w:r>
+    </w:p>
+    <w:p>
+      <w:pPr/>
+      <w:r>
+        <w:rPr>
+          <w:rFonts w:ascii="Helvetica Light" w:hAnsi="Helvetica Light" w:cs="Helvetica Light"/>
+          <w:sz w:val="24"/>
+          <w:sz-cs w:val="24"/>
+        </w:rPr>
+        <w:t xml:space="preserve">- Adversarial debiasing lowers AUC yet leaves the phone 97% identifiable.</w:t>
       </w:r>
     </w:p>
     <w:sectPr/>

</xml_diff>